<commit_message>
build: update version to 2.3.5 and merge unified master dissertation compendium
</commit_message>
<xml_diff>
--- a/docs/introductions.docx
+++ b/docs/introductions.docx
@@ -420,17 +420,105 @@
     <w:p>
       <w:pPr>
         <w:spacing w:before="0" w:after="120" w:line="276" w:lineRule="auto"/>
+        <w:jc w:val="center"/>
       </w:pPr>
+      <w:r/>
       <w:r>
-        <w:t>$$T_{\text{target}} = 38.0 + (U_{\text{cpu}} \times 0.45) + (U_{\text{mem}} \times 0.1)$$</w:t>
+        <w:rPr>
+          <w:i/>
+        </w:rPr>
+        <w:t>T</w:t>
+      </w:r>
+      <w:r>
+        <w:rPr>
+          <w:vertAlign w:val="subscript"/>
+        </w:rPr>
+        <w:t>target</w:t>
+      </w:r>
+      <w:r>
+        <w:t xml:space="preserve"> = 38.0 + (</w:t>
+      </w:r>
+      <w:r>
+        <w:rPr>
+          <w:i/>
+        </w:rPr>
+        <w:t>U</w:t>
+      </w:r>
+      <w:r>
+        <w:rPr>
+          <w:vertAlign w:val="subscript"/>
+        </w:rPr>
+        <w:t>cpu</w:t>
+      </w:r>
+      <w:r>
+        <w:t xml:space="preserve"> × 0.45) + (</w:t>
+      </w:r>
+      <w:r>
+        <w:rPr>
+          <w:i/>
+        </w:rPr>
+        <w:t>U</w:t>
+      </w:r>
+      <w:r>
+        <w:rPr>
+          <w:vertAlign w:val="subscript"/>
+        </w:rPr>
+        <w:t>mem</w:t>
+      </w:r>
+      <w:r>
+        <w:t xml:space="preserve"> × 0.1)</w:t>
       </w:r>
     </w:p>
     <w:p>
       <w:pPr>
         <w:spacing w:before="0" w:after="120" w:line="276" w:lineRule="auto"/>
+        <w:jc w:val="center"/>
       </w:pPr>
+      <w:r/>
       <w:r>
-        <w:t>$$T_{t+1} = T_t + (T_{\text{target}} - T_t) \times 0.1$$</w:t>
+        <w:rPr>
+          <w:i/>
+        </w:rPr>
+        <w:t>T</w:t>
+      </w:r>
+      <w:r>
+        <w:rPr>
+          <w:vertAlign w:val="subscript"/>
+        </w:rPr>
+        <w:t>target</w:t>
+      </w:r>
+      <w:r>
+        <w:t xml:space="preserve"> = 38.0 + (</w:t>
+      </w:r>
+      <w:r>
+        <w:rPr>
+          <w:i/>
+        </w:rPr>
+        <w:t>U</w:t>
+      </w:r>
+      <w:r>
+        <w:rPr>
+          <w:vertAlign w:val="subscript"/>
+        </w:rPr>
+        <w:t>cpu</w:t>
+      </w:r>
+      <w:r>
+        <w:t xml:space="preserve"> × 0.45) + (</w:t>
+      </w:r>
+      <w:r>
+        <w:rPr>
+          <w:i/>
+        </w:rPr>
+        <w:t>U</w:t>
+      </w:r>
+      <w:r>
+        <w:rPr>
+          <w:vertAlign w:val="subscript"/>
+        </w:rPr>
+        <w:t>mem</w:t>
+      </w:r>
+      <w:r>
+        <w:t xml:space="preserve"> × 0.1)</w:t>
       </w:r>
     </w:p>
     <w:p>

</xml_diff>